<commit_message>
Word-Dokumentation um COHV und CO40 erweitern
Die Nachweistabelle enthaelt jetzt alle vier gemessenen Wege statt zweier. Die
Sammelfreigabe ueber COHV ist ausdruecklich als der wichtigste Nachweis
hervorgehoben: dort gibt es keine Bildschirmmaske, die man besuchen koennte,
und genau daran musste die bisherige Loesung scheitern.

Der Abschnitt "Was noch aussteht" nennt MD04 und CO41 jetzt als begruendeten
Schluss statt als Messung, und sagt das auch so, damit sich niemand auf mehr
verlaesst als belegt ist. Dazu der Hinweis, dass das Planauftragsprofil des
CO40-Tests ein neutraler technischer Testfall ist und die Frage nach dem realen
Profil zu Fabio Palma und Daniel Tobler gehoert.

Co-Authored-By: Claude Opus 5 (1M context) <noreply@anthropic.com>
</commit_message>
<xml_diff>
--- a/TrafagSalesExporter/docs/ZZPRDAT_Loesung_2026-09-03.docx
+++ b/TrafagSalesExporter/docs/ZZPRDAT_Loesung_2026-09-03.docx
@@ -243,7 +243,18 @@
     </w:p>
     <w:p>
       <w:r>
-        <w:t>Zwei Aufträge im System T76, beide Material 36385, Werk 1100, Auftragsart PP21. Der Reiter „Trafag Daten“ wurde zu keinem Zeitpunkt geöffnet. Geprüft wurden beide Wege, auf denen ein Auftrag freigegeben werden kann.</w:t>
+        <w:t>Geprüft wurden vier Wege, auf denen ein Fertigungsauftrag entstehen und freigegeben werden kann. Alle Aufträge im System T76, Material 36385, Werk 1100, Auftragsart PP21. Der Reiter „Trafag Daten“ wurde in keinem einzigen Fall geöffnet.</w:t>
+      </w:r>
+    </w:p>
+    <w:p>
+      <w:r>
+        <w:rPr>
+          <w:b/>
+        </w:rPr>
+        <w:t xml:space="preserve">Der wichtigste Nachweis ist die Sammelfreigabe über COHV. </w:t>
+      </w:r>
+      <w:r>
+        <w:t>Dort gibt es überhaupt keine Bildschirmmaske, die man besuchen könnte — genau daran musste die bisherige Lösung scheitern. Dass das Datum auch dort gesetzt wird, zeigt, dass die Abhängigkeit vom Dynpro vollständig aufgelöst ist.</w:t>
       </w:r>
     </w:p>
     <w:tbl>
@@ -586,6 +597,162 @@
           </w:p>
         </w:tc>
       </w:tr>
+      <w:tr>
+        <w:tc>
+          <w:tcPr>
+            <w:tcW w:type="dxa" w:w="1728"/>
+          </w:tcPr>
+          <w:p>
+            <w:r>
+              <w:t>1241814</w:t>
+            </w:r>
+          </w:p>
+        </w:tc>
+        <w:tc>
+          <w:tcPr>
+            <w:tcW w:type="dxa" w:w="1728"/>
+          </w:tcPr>
+          <w:p>
+            <w:r>
+              <w:t>Sammelfreigabe über COHV</w:t>
+            </w:r>
+          </w:p>
+        </w:tc>
+        <w:tc>
+          <w:tcPr>
+            <w:tcW w:type="dxa" w:w="1728"/>
+          </w:tcPr>
+          <w:p>
+            <w:r>
+              <w:t>04.12.2026</w:t>
+            </w:r>
+          </w:p>
+        </w:tc>
+        <w:tc>
+          <w:tcPr>
+            <w:tcW w:type="dxa" w:w="1728"/>
+          </w:tcPr>
+          <w:p>
+            <w:r>
+              <w:t>04.12.2026</w:t>
+            </w:r>
+          </w:p>
+        </w:tc>
+        <w:tc>
+          <w:tcPr>
+            <w:tcW w:type="dxa" w:w="1728"/>
+          </w:tcPr>
+          <w:p>
+            <w:r>
+              <w:t>wird gesetzt</w:t>
+            </w:r>
+          </w:p>
+        </w:tc>
+      </w:tr>
+      <w:tr>
+        <w:tc>
+          <w:tcPr>
+            <w:tcW w:type="dxa" w:w="1728"/>
+          </w:tcPr>
+          <w:p>
+            <w:r>
+              <w:t>1241815</w:t>
+            </w:r>
+          </w:p>
+        </w:tc>
+        <w:tc>
+          <w:tcPr>
+            <w:tcW w:type="dxa" w:w="1728"/>
+          </w:tcPr>
+          <w:p>
+            <w:r>
+              <w:t>Sammelfreigabe über COHV</w:t>
+            </w:r>
+          </w:p>
+        </w:tc>
+        <w:tc>
+          <w:tcPr>
+            <w:tcW w:type="dxa" w:w="1728"/>
+          </w:tcPr>
+          <w:p>
+            <w:r>
+              <w:t>04.12.2026</w:t>
+            </w:r>
+          </w:p>
+        </w:tc>
+        <w:tc>
+          <w:tcPr>
+            <w:tcW w:type="dxa" w:w="1728"/>
+          </w:tcPr>
+          <w:p>
+            <w:r>
+              <w:t>04.12.2026</w:t>
+            </w:r>
+          </w:p>
+        </w:tc>
+        <w:tc>
+          <w:tcPr>
+            <w:tcW w:type="dxa" w:w="1728"/>
+          </w:tcPr>
+          <w:p>
+            <w:r>
+              <w:t>wird gesetzt</w:t>
+            </w:r>
+          </w:p>
+        </w:tc>
+      </w:tr>
+      <w:tr>
+        <w:tc>
+          <w:tcPr>
+            <w:tcW w:type="dxa" w:w="1728"/>
+          </w:tcPr>
+          <w:p>
+            <w:r>
+              <w:t>1241816</w:t>
+            </w:r>
+          </w:p>
+        </w:tc>
+        <w:tc>
+          <w:tcPr>
+            <w:tcW w:type="dxa" w:w="1728"/>
+          </w:tcPr>
+          <w:p>
+            <w:r>
+              <w:t>Planauftrag über CO40 umgesetzt</w:t>
+            </w:r>
+          </w:p>
+        </w:tc>
+        <w:tc>
+          <w:tcPr>
+            <w:tcW w:type="dxa" w:w="1728"/>
+          </w:tcPr>
+          <w:p>
+            <w:r>
+              <w:t>09.12.2026</w:t>
+            </w:r>
+          </w:p>
+        </w:tc>
+        <w:tc>
+          <w:tcPr>
+            <w:tcW w:type="dxa" w:w="1728"/>
+          </w:tcPr>
+          <w:p>
+            <w:r>
+              <w:t>09.12.2026</w:t>
+            </w:r>
+          </w:p>
+        </w:tc>
+        <w:tc>
+          <w:tcPr>
+            <w:tcW w:type="dxa" w:w="1728"/>
+          </w:tcPr>
+          <w:p>
+            <w:r>
+              <w:t>wird gesetzt</w:t>
+            </w:r>
+          </w:p>
+        </w:tc>
+      </w:tr>
     </w:tbl>
     <w:p/>
     <w:p>
@@ -609,12 +776,22 @@
     </w:p>
     <w:p>
       <w:r>
-        <w:t>Getestet sind bisher die beiden Dialogwege CO01 und CO02. Die Erweiterung greift technisch bei jedem Speichern und sollte deshalb auch die übrigen Wege abdecken, gemessen ist das aber noch nicht. Adil Lahrach hat MD04 im Werk CH und CO41 in CZ als die realen Wege benannt; genau diese gehören als Nächstes geprüft.</w:t>
+        <w:t>Nicht einzeln gemessen sind MD04 und CO41. Beide setzen Planaufträge um und enden im Speichern eines Fertigungsauftrags, also in demselben Ablauf, den CO40 bereits durchlaufen hat. Das ist ein begründeter Schluss, aber keine Messung — und es steht hier bewusst als solcher, damit sich niemand auf mehr verlässt, als belegt ist.</w:t>
       </w:r>
     </w:p>
     <w:p>
       <w:r>
-        <w:t>Diese Tests greifen in Planung und Fertigung ein und sollten deshalb mit der Disposition abgestimmt werden. Fabio Palma hat ausdrücklich darum gebeten, bei Änderungen im PP-Modul einbezogen zu werden.</w:t>
+        <w:t>Der für den CO40-Test verwendete Planauftrag wurde mit dem Profil „Lagerauftrag“ angelegt. Das ist ein neutraler technischer Testfall. Ob der reale Ablauf im Werk CH mit diesem oder einem anderen Profil arbeitet, ist eine Stammdatenfrage und gehört zu Fabio Palma und Daniel Tobler. Für die Frage, ob die Umsetzung das Datum schreibt, spielt das Profil keine Rolle.</w:t>
+      </w:r>
+    </w:p>
+    <w:p>
+      <w:r>
+        <w:t>Ebenfalls offen ist die Auftragsart PP22, die bei 10 der 34 Aufträge aus Marcos Liste vorkommt.</w:t>
+      </w:r>
+    </w:p>
+    <w:p>
+      <w:r>
+        <w:t>Weitere Tests greifen in Planung und Fertigung ein und sollten deshalb mit der Disposition abgestimmt werden. Fabio Palma hat ausdrücklich darum gebeten, bei Änderungen im PP-Modul einbezogen zu werden.</w:t>
       </w:r>
     </w:p>
     <w:p>
@@ -639,14 +816,6 @@
       </w:pPr>
       <w:r>
         <w:t>Umsetzung von Planaufträgen über MD04 und CO41 messen, mit der Disposition abgestimmt.</w:t>
-      </w:r>
-    </w:p>
-    <w:p>
-      <w:pPr>
-        <w:pStyle w:val="ListNumber"/>
-      </w:pPr>
-      <w:r>
-        <w:t>Sammelfreigabe über CO40 und COHV testen.</w:t>
       </w:r>
     </w:p>
     <w:p>

</xml_diff>